<commit_message>
modified some changes in the exhibit
</commit_message>
<xml_diff>
--- a/backend-exhibits/Dropbox to OneDrive Advanced Plan - Advanced Include.docx
+++ b/backend-exhibits/Dropbox to OneDrive Advanced Plan - Advanced Include.docx
@@ -1218,11 +1218,7 @@
         </w:tc>
       </w:tr>
     </w:tbl>
-    <w:p>
-      <w:r>
-        <w:t>Add Headings and they will appear in your table of contents.</w:t>
-      </w:r>
-    </w:p>
+    <w:p/>
     <w:sectPr>
       <w:pgSz w:w="12240" w:h="15840"/>
       <w:pgMar w:top="1104" w:right="1440" w:bottom="1148" w:left="1440" w:header="720" w:footer="720" w:gutter="0"/>

</xml_diff>